<commit_message>
Update CV (docx and PDF) and Shipd details
Co-Authored-By: Claude Sonnet 5.5 <noreply@anthropic.com>
</commit_message>
<xml_diff>
--- a/public/Omasan_Etsano_CV_Master.docx
+++ b/public/Omasan_Etsano_CV_Master.docx
@@ -48,7 +48,7 @@
           <w:sz w:val="17"/>
           <w:szCs w:val="17"/>
         </w:rPr>
-        <w:t xml:space="preserve">Abuja, Nigeria  |  etsanoomasan@gmail.com  |  linkedin.com/in/omasan-etsano-317219287  |  bookdex.site</w:t>
+        <w:t xml:space="preserve">Abuja, Nigeria  |  +234 816-561-3991  |  etsanoomasan@gmail.com  |  linkedin.com/in/omasan-etsano-317219287  |  bookdex.site</w:t>
       </w:r>
     </w:p>
     <w:p>
@@ -164,7 +164,7 @@
           <w:sz w:val="19"/>
           <w:szCs w:val="19"/>
         </w:rPr>
-        <w:t xml:space="preserve">React 18/19, Next.js 16, TanStack Start, Vite, Tailwind CSS, shadcn/ui, Radix UI, TanStack Query, Framer Motion, GSAP, Recharts, Leaflet, Chart.js</w:t>
+        <w:t xml:space="preserve">React 18, Vite, Tailwind CSS, shadcn/ui, Radix UI, TanStack Query, Framer Motion, GSAP, Recharts, Leaflet, Chart.js</w:t>
       </w:r>
     </w:p>
     <w:p>
@@ -388,7 +388,7 @@
           <w:sz w:val="19"/>
           <w:szCs w:val="19"/>
         </w:rPr>
-        <w:t xml:space="preserve">Authored end-to-end tasks on production Rust projects: a reference implementation of an unimplemented feature, a large test suite, a containerised offline test harness, and a specification precise enough to solve from without giving the tests away.</w:t>
+        <w:t xml:space="preserve">Authored end-to-end tasks on production Rust projects (sqlx, sea-orm): a reference implementation of an unimplemented feature, an 80+ case test suite, a containerised offline test harness, and a specification precise enough to solve from without giving the tests away.</w:t>
       </w:r>
     </w:p>
     <w:p>
@@ -915,126 +915,6 @@
           <w:szCs w:val="19"/>
         </w:rPr>
         <w:t xml:space="preserve">Hardened Supabase security, audited the codebase, built the animated production landing page, worked on Nigeria-focused SEO, and deployed on Vercel with Core Web Vitals tracking.</w:t>
-      </w:r>
-    </w:p>
-    <w:p>
-      <w:pPr>
-        <w:keepNext/>
-        <w:tabs>
-          <w:tab w:val="right" w:pos="10656"/>
-        </w:tabs>
-        <w:spacing w:after="20" w:before="90"/>
-      </w:pPr>
-      <w:r>
-        <w:rPr>
-          <w:rFonts w:ascii="Calibri" w:cs="Calibri" w:eastAsia="Calibri" w:hAnsi="Calibri"/>
-          <w:b/>
-          <w:bCs/>
-          <w:color w:val="1B2A4A"/>
-          <w:sz w:val="20"/>
-          <w:szCs w:val="20"/>
-        </w:rPr>
-        <w:t xml:space="preserve">ZOLIG Consulting website</w:t>
-      </w:r>
-      <w:r>
-        <w:rPr>
-          <w:rFonts w:ascii="Calibri" w:cs="Calibri" w:eastAsia="Calibri" w:hAnsi="Calibri"/>
-          <w:i/>
-          <w:iCs/>
-          <w:color w:val="555555"/>
-          <w:sz w:val="20"/>
-          <w:szCs w:val="20"/>
-        </w:rPr>
-        <w:t xml:space="preserve">  |  Next.js corporate site, live on Vercel</w:t>
-      </w:r>
-      <w:r>
-        <w:rPr>
-          <w:rFonts w:ascii="Calibri" w:cs="Calibri" w:eastAsia="Calibri" w:hAnsi="Calibri"/>
-          <w:color w:val="555555"/>
-          <w:sz w:val="19"/>
-          <w:szCs w:val="19"/>
-        </w:rPr>
-        <w:t xml:space="preserve">	2026</w:t>
-      </w:r>
-    </w:p>
-    <w:p>
-      <w:pPr>
-        <w:pStyle w:val="ListParagraph"/>
-        <w:numPr>
-          <w:ilvl w:val="0"/>
-          <w:numId w:val="1"/>
-        </w:numPr>
-        <w:spacing w:after="20" w:line="248"/>
-        <w:ind w:left="260" w:hanging="200"/>
-      </w:pPr>
-      <w:r>
-        <w:rPr>
-          <w:rFonts w:ascii="Calibri" w:cs="Calibri" w:eastAsia="Calibri" w:hAnsi="Calibri"/>
-          <w:color w:val="333333"/>
-          <w:sz w:val="19"/>
-          <w:szCs w:val="19"/>
-        </w:rPr>
-        <w:t xml:space="preserve">Built a corporate website for a Nigerian construction, procurement and protective-equipment company in Next.js 16, React 19 and TypeScript, with service, project, gallery and journal pages and an enquiry form. Prepared it for native Vercel deployment by replacing the Cloudflare-specific pieces of the original export. Built with AI-assisted tooling.</w:t>
-      </w:r>
-    </w:p>
-    <w:p>
-      <w:pPr>
-        <w:keepNext/>
-        <w:tabs>
-          <w:tab w:val="right" w:pos="10656"/>
-        </w:tabs>
-        <w:spacing w:after="20" w:before="90"/>
-      </w:pPr>
-      <w:r>
-        <w:rPr>
-          <w:rFonts w:ascii="Calibri" w:cs="Calibri" w:eastAsia="Calibri" w:hAnsi="Calibri"/>
-          <w:b/>
-          <w:bCs/>
-          <w:color w:val="1B2A4A"/>
-          <w:sz w:val="20"/>
-          <w:szCs w:val="20"/>
-        </w:rPr>
-        <w:t xml:space="preserve">Bomas Academy website</w:t>
-      </w:r>
-      <w:r>
-        <w:rPr>
-          <w:rFonts w:ascii="Calibri" w:cs="Calibri" w:eastAsia="Calibri" w:hAnsi="Calibri"/>
-          <w:i/>
-          <w:iCs/>
-          <w:color w:val="555555"/>
-          <w:sz w:val="20"/>
-          <w:szCs w:val="20"/>
-        </w:rPr>
-        <w:t xml:space="preserve">  |  School site and admin redesign, TanStack Start and Supabase</w:t>
-      </w:r>
-      <w:r>
-        <w:rPr>
-          <w:rFonts w:ascii="Calibri" w:cs="Calibri" w:eastAsia="Calibri" w:hAnsi="Calibri"/>
-          <w:color w:val="555555"/>
-          <w:sz w:val="19"/>
-          <w:szCs w:val="19"/>
-        </w:rPr>
-        <w:t xml:space="preserve">	2026</w:t>
-      </w:r>
-    </w:p>
-    <w:p>
-      <w:pPr>
-        <w:pStyle w:val="ListParagraph"/>
-        <w:numPr>
-          <w:ilvl w:val="0"/>
-          <w:numId w:val="1"/>
-        </w:numPr>
-        <w:spacing w:after="20" w:line="248"/>
-        <w:ind w:left="260" w:hanging="200"/>
-      </w:pPr>
-      <w:r>
-        <w:rPr>
-          <w:rFonts w:ascii="Calibri" w:cs="Calibri" w:eastAsia="Calibri" w:hAnsi="Calibri"/>
-          <w:color w:val="333333"/>
-          <w:sz w:val="19"/>
-          <w:szCs w:val="19"/>
-        </w:rPr>
-        <w:t xml:space="preserve">Redesigned the public site and staff admin area of an existing school codebase (React 19, TanStack Start, Supabase, Tailwind v4, Framer Motion): navigation and mobile menu, admissions and news pages, and admin screens for content, staff, news and gallery. Updated the build to a TanStack Start version Vercel accepts.</w:t>
       </w:r>
     </w:p>
     <w:p>

</xml_diff>